<commit_message>
report: novelty redefined, section 5.24 RF-E2E, one-pager updated
</commit_message>
<xml_diff>
--- a/docs/research/NOVELTY_REPORT/NOVELTY_ONE_PAGER.docx
+++ b/docs/research/NOVELTY_REPORT/NOVELTY_ONE_PAGER.docx
@@ -53,7 +53,179 @@
       </w:pPr>
       <w:r>
         <w:rPr/>
-        <w:t>The claim, stated narrowly</w:t>
+        <w:t>The contribution (redefined 2026-10-16 night)</w:t>
+      </w:r>
+    </w:p>
+    <w:p>
+      <w:pPr>
+        <w:pStyle w:val="BodyText"/>
+        <w:bidi w:val="0"/>
+        <w:rPr/>
+      </w:pPr>
+      <w:r>
+        <w:rPr>
+          <w:b/>
+        </w:rPr>
+        <w:t>Novelty, redefined (2026-10-16 night; supersedes the ranking in 8a and 8b).</w:t>
+      </w:r>
+      <w:r>
+        <w:rPr/>
+        <w:t xml:space="preserve"> The paper is a methods-and-measurement paper on </w:t>
+      </w:r>
+      <w:r>
+        <w:rPr>
+          <w:b/>
+        </w:rPr>
+        <w:t>reader-faithfulness</w:t>
+      </w:r>
+      <w:r>
+        <w:rPr/>
+        <w:t>: the output of a position-aware reading assistant at chapter c may depend only on chapters up to c.</w:t>
+      </w:r>
+    </w:p>
+    <w:p>
+      <w:pPr>
+        <w:pStyle w:val="BodyText"/>
+        <w:numPr>
+          <w:ilvl w:val="0"/>
+          <w:numId w:val="1"/>
+        </w:numPr>
+        <w:tabs>
+          <w:tab w:val="clear" w:pos="1134"/>
+          <w:tab w:val="left" w:pos="709" w:leader="none"/>
+        </w:tabs>
+        <w:bidi w:val="0"/>
+        <w:spacing w:before="0" w:after="0"/>
+        <w:ind w:hanging="283" w:left="709"/>
+        <w:rPr/>
+      </w:pPr>
+      <w:r>
+        <w:rPr>
+          <w:b/>
+        </w:rPr>
+        <w:t>Definition and guarantees.</w:t>
+      </w:r>
+      <w:r>
+        <w:rPr/>
+        <w:t xml:space="preserve"> A two-part contract (input channel, parameter channel), the observation that they compose and that passing one audit does not certify the other, and elementary, property-tested guarantees for the repairs (versioning by evidence horizon has zero divergence for any prefix-only derivation; hiding beats doing nothing only when fewer in-window prefixes already hold the final value; prefix-decided gates remove prominence leaks).</w:t>
+      </w:r>
+    </w:p>
+    <w:p>
+      <w:pPr>
+        <w:pStyle w:val="BodyText"/>
+        <w:numPr>
+          <w:ilvl w:val="0"/>
+          <w:numId w:val="1"/>
+        </w:numPr>
+        <w:tabs>
+          <w:tab w:val="clear" w:pos="1134"/>
+          <w:tab w:val="left" w:pos="709" w:leader="none"/>
+        </w:tabs>
+        <w:bidi w:val="0"/>
+        <w:spacing w:before="0" w:after="0"/>
+        <w:ind w:hanging="283" w:left="709"/>
+        <w:rPr/>
+      </w:pPr>
+      <w:r>
+        <w:rPr>
+          <w:b/>
+        </w:rPr>
+        <w:t>Derivation look-ahead is a design defect, found and fixed on two systems (strongest).</w:t>
+      </w:r>
+      <w:r>
+        <w:rPr/>
+        <w:t xml:space="preserve"> On the deployed narrative graph: 6.0% of 685 character-cuts diverge, the versioned repair gives 0, naive hiding is worse (82 vs 23). On the generic whole-volume LLM character card (pre-registered, 54 reveal events): the card names the hidden identity before the reveal in 18.5% of events for 7 to 8B models and 23.1% for 24 to 32B models </w:t>
+      </w:r>
+      <w:r>
+        <w:rPr>
+          <w:b/>
+        </w:rPr>
+        <w:t>under cipher names no model has seen</w:t>
+      </w:r>
+      <w:r>
+        <w:rPr/>
+        <w:t>, against 1.2% and 1.9% for the versioned card (strict text rule: 24.6% and 21.1% vs 0%); every one of five models is positive; a second judge agrees on 97.8% of labels (kappa 0.88).</w:t>
+      </w:r>
+    </w:p>
+    <w:p>
+      <w:pPr>
+        <w:pStyle w:val="BodyText"/>
+        <w:numPr>
+          <w:ilvl w:val="0"/>
+          <w:numId w:val="1"/>
+        </w:numPr>
+        <w:tabs>
+          <w:tab w:val="clear" w:pos="1134"/>
+          <w:tab w:val="left" w:pos="709" w:leader="none"/>
+        </w:tabs>
+        <w:bidi w:val="0"/>
+        <w:spacing w:before="0" w:after="0"/>
+        <w:ind w:hanging="283" w:left="709"/>
+        <w:rPr/>
+      </w:pPr>
+      <w:r>
+        <w:rPr>
+          <w:b/>
+        </w:rPr>
+        <w:t>Input and memory leaks separated on one system with one oracle.</w:t>
+      </w:r>
+      <w:r>
+        <w:rPr/>
+        <w:t xml:space="preserve"> At the reveal cut the memory-only leak is +2.5 points (7 to 8B) and +0.0 points (24 to 32B) while the build leak is about 20 points: for these books the pipeline, not the model, is the main risk.</w:t>
+      </w:r>
+    </w:p>
+    <w:p>
+      <w:pPr>
+        <w:pStyle w:val="BodyText"/>
+        <w:numPr>
+          <w:ilvl w:val="0"/>
+          <w:numId w:val="1"/>
+        </w:numPr>
+        <w:tabs>
+          <w:tab w:val="clear" w:pos="1134"/>
+          <w:tab w:val="left" w:pos="709" w:leader="none"/>
+        </w:tabs>
+        <w:bidi w:val="0"/>
+        <w:ind w:hanging="283" w:left="709"/>
+        <w:rPr/>
+      </w:pPr>
+      <w:r>
+        <w:rPr>
+          <w:b/>
+        </w:rPr>
+        <w:t>Premature resolution under prefix truncation (parameter channel).</w:t>
+      </w:r>
+      <w:r>
+        <w:rPr/>
+        <w:t xml:space="preserve"> A text-derived entitlement oracle, a renaming probe with a memory-free validity gate, and the finding that plain renaming validity checks are memory-assisted on famous books; the effect is large on famous books (exploratory, +26.0 points for a reference model) and bounded below about 5 points on obscure books (pre-registered, three 24 to 32B models).</w:t>
+      </w:r>
+    </w:p>
+    <w:p>
+      <w:pPr>
+        <w:pStyle w:val="BodyText"/>
+        <w:bidi w:val="0"/>
+        <w:rPr/>
+      </w:pPr>
+      <w:r>
+        <w:rPr>
+          <w:b/>
+        </w:rPr>
+        <w:t>Not claimed:</w:t>
+      </w:r>
+      <w:r>
+        <w:rPr/>
+        <w:t xml:space="preserve"> fame dependence of memorisation (Chang et al. 2023), name replacement and pseudonymisation (Jiang and Ferraro), point-in-time correctness (feature stores), look-ahead bias as a concept (finance LLM work). Prior-art search was bounded; "to our knowledge" applies.</w:t>
+      </w:r>
+    </w:p>
+    <w:p>
+      <w:pPr>
+        <w:pStyle w:val="Heading2"/>
+        <w:bidi w:val="0"/>
+        <w:rPr/>
+      </w:pPr>
+      <w:r>
+        <w:rPr/>
+        <w:t>Channel 1 claim, stated narrowly</w:t>
       </w:r>
     </w:p>
     <w:p>
@@ -790,6 +962,28 @@
       </w:pPr>
       <w:r>
         <w:rPr/>
+        <w:t>Found and fixed in a second system (pre-registered, 2026-10-16)</w:t>
+      </w:r>
+    </w:p>
+    <w:p>
+      <w:pPr>
+        <w:pStyle w:val="BodyText"/>
+        <w:bidi w:val="0"/>
+        <w:rPr/>
+      </w:pPr>
+      <w:r>
+        <w:rPr/>
+        <w:t>RF-E2E (pre-registered, addenda 6 and 7, written before any card was read): on 54 confirmatory reveal events, a whole-volume LLM character card stamped at first mention names the hidden identity before the reveal in 18.5% of events under cipher names no model has seen (judge rule; strict text rule 24.6% of 19), against 1.2% for the versioned (prefix-built) card. Input-channel RF1 SUPPORTED on the primary text rule (+24.6 [+8.8, +42.1]) and SUPPORTED on the judge rule (+17.3 [+9.3, +26.5]); memory-only leak +2.5 [+0.0, +5.6]. Pseudonymise-and-map-back: prefix-card leak 3.7% to 3.1% (RF5 not evaluated: no memory leak to fix). Models: llama3.1:8b, mistral:7b-instruct, qwen2.5:7b; not run: none. Larger open models (mistral24, qwen32b, addendum 8): W-ren 23.1% vs P-ren 1.9%; memory-only leak +0.0 points. This shows the look-ahead defect is a property of a common assistant design, not of our code, separates the input leak from the memory leak on one system, and shows the versioned repair removing it. Section 5.24 of the report.</w:t>
+      </w:r>
+    </w:p>
+    <w:p>
+      <w:pPr>
+        <w:pStyle w:val="Heading2"/>
+        <w:bidi w:val="0"/>
+        <w:rPr/>
+      </w:pPr>
+      <w:r>
+        <w:rPr/>
         <w:t>Confirmatory run (pre-registered, 2026-10-16): the effect was NOT detected on obscure books</w:t>
       </w:r>
     </w:p>
@@ -840,7 +1034,7 @@
         <w:pStyle w:val="BodyText"/>
         <w:numPr>
           <w:ilvl w:val="0"/>
-          <w:numId w:val="1"/>
+          <w:numId w:val="2"/>
         </w:numPr>
         <w:tabs>
           <w:tab w:val="clear" w:pos="1134"/>
@@ -867,7 +1061,7 @@
         <w:pStyle w:val="BodyText"/>
         <w:numPr>
           <w:ilvl w:val="0"/>
-          <w:numId w:val="1"/>
+          <w:numId w:val="2"/>
         </w:numPr>
         <w:tabs>
           <w:tab w:val="clear" w:pos="1134"/>
@@ -1063,6 +1257,125 @@
   <w:abstractNum w:abstractNumId="1">
     <w:lvl w:ilvl="0">
       <w:start w:val="1"/>
+      <w:numFmt w:val="decimal"/>
+      <w:lvlText w:val="%1."/>
+      <w:lvlJc w:val="left"/>
+      <w:pPr>
+        <w:tabs>
+          <w:tab w:val="num" w:pos="709"/>
+        </w:tabs>
+        <w:ind w:left="709" w:hanging="283"/>
+      </w:pPr>
+      <w:rPr/>
+    </w:lvl>
+    <w:lvl w:ilvl="1">
+      <w:start w:val="1"/>
+      <w:numFmt w:val="decimal"/>
+      <w:lvlText w:val="%2."/>
+      <w:lvlJc w:val="left"/>
+      <w:pPr>
+        <w:tabs>
+          <w:tab w:val="num" w:pos="1418"/>
+        </w:tabs>
+        <w:ind w:left="1418" w:hanging="283"/>
+      </w:pPr>
+      <w:rPr/>
+    </w:lvl>
+    <w:lvl w:ilvl="2">
+      <w:start w:val="1"/>
+      <w:numFmt w:val="decimal"/>
+      <w:lvlText w:val="%3."/>
+      <w:lvlJc w:val="left"/>
+      <w:pPr>
+        <w:tabs>
+          <w:tab w:val="num" w:pos="2127"/>
+        </w:tabs>
+        <w:ind w:left="2127" w:hanging="283"/>
+      </w:pPr>
+      <w:rPr/>
+    </w:lvl>
+    <w:lvl w:ilvl="3">
+      <w:start w:val="1"/>
+      <w:numFmt w:val="decimal"/>
+      <w:lvlText w:val="%4."/>
+      <w:lvlJc w:val="left"/>
+      <w:pPr>
+        <w:tabs>
+          <w:tab w:val="num" w:pos="2836"/>
+        </w:tabs>
+        <w:ind w:left="2836" w:hanging="283"/>
+      </w:pPr>
+      <w:rPr/>
+    </w:lvl>
+    <w:lvl w:ilvl="4">
+      <w:start w:val="1"/>
+      <w:numFmt w:val="decimal"/>
+      <w:lvlText w:val="%5."/>
+      <w:lvlJc w:val="left"/>
+      <w:pPr>
+        <w:tabs>
+          <w:tab w:val="num" w:pos="3545"/>
+        </w:tabs>
+        <w:ind w:left="3545" w:hanging="283"/>
+      </w:pPr>
+      <w:rPr/>
+    </w:lvl>
+    <w:lvl w:ilvl="5">
+      <w:start w:val="1"/>
+      <w:numFmt w:val="decimal"/>
+      <w:lvlText w:val="%6."/>
+      <w:lvlJc w:val="left"/>
+      <w:pPr>
+        <w:tabs>
+          <w:tab w:val="num" w:pos="4254"/>
+        </w:tabs>
+        <w:ind w:left="4254" w:hanging="283"/>
+      </w:pPr>
+      <w:rPr/>
+    </w:lvl>
+    <w:lvl w:ilvl="6">
+      <w:start w:val="1"/>
+      <w:numFmt w:val="decimal"/>
+      <w:lvlText w:val="%7."/>
+      <w:lvlJc w:val="left"/>
+      <w:pPr>
+        <w:tabs>
+          <w:tab w:val="num" w:pos="4963"/>
+        </w:tabs>
+        <w:ind w:left="4963" w:hanging="283"/>
+      </w:pPr>
+      <w:rPr/>
+    </w:lvl>
+    <w:lvl w:ilvl="7">
+      <w:start w:val="1"/>
+      <w:numFmt w:val="decimal"/>
+      <w:lvlText w:val="%8."/>
+      <w:lvlJc w:val="left"/>
+      <w:pPr>
+        <w:tabs>
+          <w:tab w:val="num" w:pos="5672"/>
+        </w:tabs>
+        <w:ind w:left="5672" w:hanging="283"/>
+      </w:pPr>
+      <w:rPr/>
+    </w:lvl>
+    <w:lvl w:ilvl="8">
+      <w:start w:val="1"/>
+      <w:numFmt w:val="decimal"/>
+      <w:lvlText w:val="%9."/>
+      <w:lvlJc w:val="left"/>
+      <w:pPr>
+        <w:tabs>
+          <w:tab w:val="num" w:pos="6381"/>
+        </w:tabs>
+        <w:ind w:left="6381" w:hanging="283"/>
+      </w:pPr>
+      <w:rPr/>
+    </w:lvl>
+  </w:abstractNum>
+  <w:abstractNum w:abstractNumId="2">
+    <w:lvl w:ilvl="0">
+      <w:start w:val="1"/>
       <w:numFmt w:val="bullet"/>
       <w:lvlText w:val=""/>
       <w:lvlJc w:val="left"/>
@@ -1197,7 +1510,7 @@
       </w:rPr>
     </w:lvl>
   </w:abstractNum>
-  <w:abstractNum w:abstractNumId="2">
+  <w:abstractNum w:abstractNumId="3">
     <w:lvl w:ilvl="0">
       <w:start w:val="1"/>
       <w:numFmt w:val="none"/>
@@ -1322,6 +1635,9 @@
   </w:num>
   <w:num w:numId="2">
     <w:abstractNumId w:val="2"/>
+  </w:num>
+  <w:num w:numId="3">
+    <w:abstractNumId w:val="3"/>
   </w:num>
 </w:numbering>
 </file>
@@ -1425,6 +1741,11 @@
       <w:sz w:val="19"/>
       <w:szCs w:val="19"/>
     </w:rPr>
+  </w:style>
+  <w:style w:type="character" w:styleId="NumberingSymbols">
+    <w:name w:val="Numbering Symbols"/>
+    <w:qFormat/>
+    <w:rPr/>
   </w:style>
   <w:style w:type="character" w:styleId="Bullets">
     <w:name w:val="Bullets"/>

</xml_diff>

<commit_message>
addendum 11 results (earlier positions, second prompt) in paper 7.8, reports, course files and Research page; page headline shows the current results, outdated plan panel removed; slide numbers follow the new order
</commit_message>
<xml_diff>
--- a/docs/research/NOVELTY_REPORT/NOVELTY_ONE_PAGER.docx
+++ b/docs/research/NOVELTY_REPORT/NOVELTY_ONE_PAGER.docx
@@ -974,6 +974,23 @@
       <w:r>
         <w:rPr/>
         <w:t>RF-E2E (pre-registered, addenda 6 and 7, written before any card was read): on 54 confirmatory reveal events, a whole-volume LLM character card stamped at first mention names the hidden identity before the reveal in 18.5% of events under cipher names no model has seen (judge rule; strict text rule 24.6% of 19), against 1.2% for the versioned (prefix-built) card. Input-channel RF1 SUPPORTED on the primary text rule (+24.6 [+8.8, +42.1]) and SUPPORTED on the judge rule (+17.3 [+9.3, +26.5]); memory-only leak +2.5 [+0.0, +5.6]. Pseudonymise-and-map-back: prefix-card leak 3.7% to 3.1% (RF5 not evaluated: no memory leak to fix). Models: llama3.1:8b, mistral:7b-instruct, qwen2.5:7b; not run: none. Larger open models (mistral24, qwen32b, addendum 8): W-ren 23.1% vs P-ren 1.9%; memory-only leak +0.0 points. This shows the look-ahead defect is a property of a common assistant design, not of our code, separates the input leak from the memory leak on one system, and shows the versioned repair removing it. Section 5.24 of the report.</w:t>
+      </w:r>
+    </w:p>
+    <w:p>
+      <w:pPr>
+        <w:pStyle w:val="BodyText"/>
+        <w:bidi w:val="0"/>
+        <w:rPr/>
+      </w:pPr>
+      <w:r>
+        <w:rPr>
+          <w:b/>
+        </w:rPr>
+        <w:t>Positions and prompt (addendum 11, Qwen2.5-7B).</w:t>
+      </w:r>
+      <w:r>
+        <w:rPr/>
+        <w:t xml:space="preserve"> Rule A (text): the versioned card leaks in 0.0% at the half-way position and 0.0% at three quarters, while the whole-volume card, served from the first mention, leaks in 21.1% at every position; with the second prompt the input channel is +26.3 [+10.5, +47.4], robust to the prompt. Rule B (judge): the versioned card leaks in 1.9% at the half-way position and 1.9% at three quarters, while the whole-volume card, served from the first mention, leaks in 16.7% at every position; with the second prompt the input channel is +18.5 [+9.3, +29.6], robust to the prompt.</w:t>
       </w:r>
     </w:p>
     <w:p>

</xml_diff>

<commit_message>
paper and reports: sections 3.3, 5.4, 7.9 and 7.10 (suffix canaries, selection leak, counterfactual suffix), FORMAL P9 to P11, novelty report v1.9 and one-pager
</commit_message>
<xml_diff>
--- a/docs/research/NOVELTY_REPORT/NOVELTY_ONE_PAGER.docx
+++ b/docs/research/NOVELTY_REPORT/NOVELTY_ONE_PAGER.docx
@@ -949,6 +949,399 @@
             <w:r>
               <w:rPr/>
               <w:t>5.19</w:t>
+            </w:r>
+          </w:p>
+        </w:tc>
+      </w:tr>
+    </w:tbl>
+    <w:p>
+      <w:pPr>
+        <w:pStyle w:val="Heading2"/>
+        <w:bidi w:val="0"/>
+        <w:rPr/>
+      </w:pPr>
+      <w:r>
+        <w:rPr/>
+        <w:t>New on 2026-10-17: the audit has to fit the leak kind (pre-registered, local models only, $0)</w:t>
+      </w:r>
+    </w:p>
+    <w:tbl>
+      <w:tblPr>
+        <w:tblW w:w="5000" w:type="pct"/>
+        <w:jc w:val="left"/>
+        <w:tblInd w:w="45" w:type="dxa"/>
+        <w:tblLayout w:type="fixed"/>
+        <w:tblCellMar>
+          <w:top w:w="45" w:type="dxa"/>
+          <w:left w:w="45" w:type="dxa"/>
+          <w:bottom w:w="45" w:type="dxa"/>
+          <w:right w:w="45" w:type="dxa"/>
+        </w:tblCellMar>
+      </w:tblPr>
+      <w:tblGrid>
+        <w:gridCol w:w="5336"/>
+        <w:gridCol w:w="6003"/>
+      </w:tblGrid>
+      <w:tr>
+        <w:trPr/>
+        <w:tc>
+          <w:tcPr>
+            <w:tcW w:w="5336" w:type="dxa"/>
+            <w:tcBorders>
+              <w:top w:val="single" w:sz="6" w:space="0" w:color="808080"/>
+              <w:left w:val="single" w:sz="6" w:space="0" w:color="808080"/>
+              <w:bottom w:val="single" w:sz="2" w:space="0" w:color="808080"/>
+              <w:right w:val="single" w:sz="6" w:space="0" w:color="808080"/>
+            </w:tcBorders>
+            <w:vAlign w:val="center"/>
+          </w:tcPr>
+          <w:p>
+            <w:pPr>
+              <w:pStyle w:val="TableHeading"/>
+              <w:suppressLineNumbers/>
+              <w:bidi w:val="0"/>
+              <w:spacing w:before="0" w:after="283"/>
+              <w:jc w:val="center"/>
+              <w:rPr/>
+            </w:pPr>
+            <w:r>
+              <w:rPr/>
+              <w:t>Test</w:t>
+            </w:r>
+          </w:p>
+        </w:tc>
+        <w:tc>
+          <w:tcPr>
+            <w:tcW w:w="6003" w:type="dxa"/>
+            <w:tcBorders>
+              <w:top w:val="single" w:sz="6" w:space="0" w:color="808080"/>
+              <w:left w:val="single" w:sz="2" w:space="0" w:color="808080"/>
+              <w:bottom w:val="single" w:sz="2" w:space="0" w:color="808080"/>
+              <w:right w:val="single" w:sz="6" w:space="0" w:color="808080"/>
+            </w:tcBorders>
+            <w:vAlign w:val="center"/>
+          </w:tcPr>
+          <w:p>
+            <w:pPr>
+              <w:pStyle w:val="TableHeading"/>
+              <w:suppressLineNumbers/>
+              <w:bidi w:val="0"/>
+              <w:spacing w:before="0" w:after="283"/>
+              <w:jc w:val="center"/>
+              <w:rPr/>
+            </w:pPr>
+            <w:r>
+              <w:rPr/>
+              <w:t>Result</w:t>
+            </w:r>
+          </w:p>
+        </w:tc>
+      </w:tr>
+      <w:tr>
+        <w:trPr/>
+        <w:tc>
+          <w:tcPr>
+            <w:tcW w:w="5336" w:type="dxa"/>
+            <w:tcBorders>
+              <w:left w:val="single" w:sz="6" w:space="0" w:color="808080"/>
+              <w:bottom w:val="single" w:sz="2" w:space="0" w:color="808080"/>
+              <w:right w:val="single" w:sz="6" w:space="0" w:color="808080"/>
+            </w:tcBorders>
+            <w:vAlign w:val="center"/>
+          </w:tcPr>
+          <w:p>
+            <w:pPr>
+              <w:pStyle w:val="TableContents"/>
+              <w:bidi w:val="0"/>
+              <w:spacing w:before="0" w:after="283"/>
+              <w:rPr/>
+            </w:pPr>
+            <w:r>
+              <w:rPr>
+                <w:b/>
+              </w:rPr>
+              <w:t>Suffix canaries</w:t>
+            </w:r>
+            <w:r>
+              <w:rPr/>
+              <w:t xml:space="preserve"> (invented names and a fact planted only after the reader's position; string match, no judge, no false positives by construction)</w:t>
+            </w:r>
+          </w:p>
+        </w:tc>
+        <w:tc>
+          <w:tcPr>
+            <w:tcW w:w="6003" w:type="dxa"/>
+            <w:tcBorders>
+              <w:left w:val="single" w:sz="2" w:space="0" w:color="808080"/>
+              <w:bottom w:val="single" w:sz="2" w:space="0" w:color="808080"/>
+              <w:right w:val="single" w:sz="6" w:space="0" w:color="808080"/>
+            </w:tcBorders>
+            <w:vAlign w:val="center"/>
+          </w:tcPr>
+          <w:p>
+            <w:pPr>
+              <w:pStyle w:val="TableContents"/>
+              <w:bidi w:val="0"/>
+              <w:spacing w:before="0" w:after="283"/>
+              <w:rPr/>
+            </w:pPr>
+            <w:r>
+              <w:rPr/>
+              <w:t xml:space="preserve">Whole-volume card: </w:t>
+            </w:r>
+            <w:r>
+              <w:rPr>
+                <w:b/>
+              </w:rPr>
+              <w:t>22.8% [14.2, 31.5] of all 54 events vs 0</w:t>
+            </w:r>
+            <w:r>
+              <w:rPr/>
+              <w:t xml:space="preserve"> for the versioned card; 3/3 models</w:t>
+            </w:r>
+          </w:p>
+        </w:tc>
+      </w:tr>
+      <w:tr>
+        <w:trPr/>
+        <w:tc>
+          <w:tcPr>
+            <w:tcW w:w="5336" w:type="dxa"/>
+            <w:tcBorders>
+              <w:left w:val="single" w:sz="6" w:space="0" w:color="808080"/>
+              <w:bottom w:val="single" w:sz="2" w:space="0" w:color="808080"/>
+              <w:right w:val="single" w:sz="6" w:space="0" w:color="808080"/>
+            </w:tcBorders>
+            <w:vAlign w:val="center"/>
+          </w:tcPr>
+          <w:p>
+            <w:pPr>
+              <w:pStyle w:val="TableContents"/>
+              <w:bidi w:val="0"/>
+              <w:spacing w:before="0" w:after="283"/>
+              <w:rPr/>
+            </w:pPr>
+            <w:r>
+              <w:rPr>
+                <w:b/>
+              </w:rPr>
+              <w:t>Long-context assistant told where the reader is</w:t>
+            </w:r>
+            <w:r>
+              <w:rPr/>
+              <w:t xml:space="preserve"> ("do not reveal anything after the marker")</w:t>
+            </w:r>
+          </w:p>
+        </w:tc>
+        <w:tc>
+          <w:tcPr>
+            <w:tcW w:w="6003" w:type="dxa"/>
+            <w:tcBorders>
+              <w:left w:val="single" w:sz="2" w:space="0" w:color="808080"/>
+              <w:bottom w:val="single" w:sz="2" w:space="0" w:color="808080"/>
+              <w:right w:val="single" w:sz="6" w:space="0" w:color="808080"/>
+            </w:tcBorders>
+            <w:vAlign w:val="center"/>
+          </w:tcPr>
+          <w:p>
+            <w:pPr>
+              <w:pStyle w:val="TableContents"/>
+              <w:bidi w:val="0"/>
+              <w:spacing w:before="0" w:after="283"/>
+              <w:rPr/>
+            </w:pPr>
+            <w:r>
+              <w:rPr/>
+              <w:t xml:space="preserve">Quotes the post-marker name in </w:t>
+            </w:r>
+            <w:r>
+              <w:rPr>
+                <w:b/>
+              </w:rPr>
+              <w:t>40.6% [29.7, 51.4] of 46 events vs 0</w:t>
+            </w:r>
+            <w:r>
+              <w:rPr/>
+              <w:t xml:space="preserve"> with the suffix removed; 88% of those hits equate the alias with the planted identity (post hoc)</w:t>
+            </w:r>
+          </w:p>
+        </w:tc>
+      </w:tr>
+      <w:tr>
+        <w:trPr/>
+        <w:tc>
+          <w:tcPr>
+            <w:tcW w:w="5336" w:type="dxa"/>
+            <w:tcBorders>
+              <w:left w:val="single" w:sz="6" w:space="0" w:color="808080"/>
+              <w:bottom w:val="single" w:sz="2" w:space="0" w:color="808080"/>
+              <w:right w:val="single" w:sz="6" w:space="0" w:color="808080"/>
+            </w:tcBorders>
+            <w:vAlign w:val="center"/>
+          </w:tcPr>
+          <w:p>
+            <w:pPr>
+              <w:pStyle w:val="TableContents"/>
+              <w:bidi w:val="0"/>
+              <w:spacing w:before="0" w:after="283"/>
+              <w:rPr/>
+            </w:pPr>
+            <w:r>
+              <w:rPr>
+                <w:b/>
+              </w:rPr>
+              <w:t>Selection leak</w:t>
+            </w:r>
+            <w:r>
+              <w:rPr/>
+              <w:t xml:space="preserve"> (every passage served is before the reader; a whole-volume entity merge chose them)</w:t>
+            </w:r>
+          </w:p>
+        </w:tc>
+        <w:tc>
+          <w:tcPr>
+            <w:tcW w:w="6003" w:type="dxa"/>
+            <w:tcBorders>
+              <w:left w:val="single" w:sz="2" w:space="0" w:color="808080"/>
+              <w:bottom w:val="single" w:sz="2" w:space="0" w:color="808080"/>
+              <w:right w:val="single" w:sz="6" w:space="0" w:color="808080"/>
+            </w:tcBorders>
+            <w:vAlign w:val="center"/>
+          </w:tcPr>
+          <w:p>
+            <w:pPr>
+              <w:pStyle w:val="TableContents"/>
+              <w:bidi w:val="0"/>
+              <w:spacing w:before="0" w:after="283"/>
+              <w:rPr/>
+            </w:pPr>
+            <w:r>
+              <w:rPr/>
+              <w:t xml:space="preserve">Card names the hidden identity in </w:t>
+            </w:r>
+            <w:r>
+              <w:rPr>
+                <w:b/>
+              </w:rPr>
+              <w:t>19.4% vs 1.4%</w:t>
+            </w:r>
+            <w:r>
+              <w:rPr/>
+              <w:t xml:space="preserve"> of 24 merged events (+18.1 [+4.2, +33.3]; judge rule); invisible to canaries and to position filters</w:t>
+            </w:r>
+          </w:p>
+        </w:tc>
+      </w:tr>
+      <w:tr>
+        <w:trPr/>
+        <w:tc>
+          <w:tcPr>
+            <w:tcW w:w="5336" w:type="dxa"/>
+            <w:tcBorders>
+              <w:left w:val="single" w:sz="6" w:space="0" w:color="808080"/>
+              <w:bottom w:val="single" w:sz="2" w:space="0" w:color="808080"/>
+              <w:right w:val="single" w:sz="6" w:space="0" w:color="808080"/>
+            </w:tcBorders>
+            <w:vAlign w:val="center"/>
+          </w:tcPr>
+          <w:p>
+            <w:pPr>
+              <w:pStyle w:val="TableContents"/>
+              <w:bidi w:val="0"/>
+              <w:spacing w:before="0" w:after="283"/>
+              <w:rPr/>
+            </w:pPr>
+            <w:r>
+              <w:rPr>
+                <w:b/>
+              </w:rPr>
+              <w:t>Counterfactual suffix on the deployed graph</w:t>
+            </w:r>
+            <w:r>
+              <w:rPr/>
+              <w:t xml:space="preserve"> (pronouns swapped after the cut only)</w:t>
+            </w:r>
+          </w:p>
+        </w:tc>
+        <w:tc>
+          <w:tcPr>
+            <w:tcW w:w="6003" w:type="dxa"/>
+            <w:tcBorders>
+              <w:left w:val="single" w:sz="2" w:space="0" w:color="808080"/>
+              <w:bottom w:val="single" w:sz="2" w:space="0" w:color="808080"/>
+              <w:right w:val="single" w:sz="6" w:space="0" w:color="808080"/>
+            </w:tcBorders>
+            <w:vAlign w:val="center"/>
+          </w:tcPr>
+          <w:p>
+            <w:pPr>
+              <w:pStyle w:val="TableContents"/>
+              <w:bidi w:val="0"/>
+              <w:spacing w:before="0" w:after="283"/>
+              <w:rPr/>
+            </w:pPr>
+            <w:r>
+              <w:rPr/>
+              <w:t xml:space="preserve">Served gender depends on later chapters in </w:t>
+            </w:r>
+            <w:r>
+              <w:rPr>
+                <w:b/>
+              </w:rPr>
+              <w:t>47 of 289</w:t>
+            </w:r>
+            <w:r>
+              <w:rPr/>
+              <w:t xml:space="preserve"> character-cuts, twice the 23 truncation finds; 0 after the repair; screen sound under this second oracle</w:t>
+            </w:r>
+          </w:p>
+        </w:tc>
+      </w:tr>
+      <w:tr>
+        <w:trPr/>
+        <w:tc>
+          <w:tcPr>
+            <w:tcW w:w="5336" w:type="dxa"/>
+            <w:tcBorders>
+              <w:left w:val="single" w:sz="6" w:space="0" w:color="808080"/>
+              <w:bottom w:val="single" w:sz="6" w:space="0" w:color="808080"/>
+              <w:right w:val="single" w:sz="6" w:space="0" w:color="808080"/>
+            </w:tcBorders>
+            <w:vAlign w:val="center"/>
+          </w:tcPr>
+          <w:p>
+            <w:pPr>
+              <w:pStyle w:val="TableContents"/>
+              <w:bidi w:val="0"/>
+              <w:spacing w:before="0" w:after="283"/>
+              <w:rPr/>
+            </w:pPr>
+            <w:r>
+              <w:rPr/>
+              <w:t>Theory</w:t>
+            </w:r>
+          </w:p>
+        </w:tc>
+        <w:tc>
+          <w:tcPr>
+            <w:tcW w:w="6003" w:type="dxa"/>
+            <w:tcBorders>
+              <w:left w:val="single" w:sz="2" w:space="0" w:color="808080"/>
+              <w:bottom w:val="single" w:sz="6" w:space="0" w:color="808080"/>
+              <w:right w:val="single" w:sz="6" w:space="0" w:color="808080"/>
+            </w:tcBorders>
+            <w:vAlign w:val="center"/>
+          </w:tcPr>
+          <w:p>
+            <w:pPr>
+              <w:pStyle w:val="TableContents"/>
+              <w:bidi w:val="0"/>
+              <w:spacing w:before="0" w:after="283"/>
+              <w:rPr/>
+            </w:pPr>
+            <w:r>
+              <w:rPr/>
+              <w:t>FORMAL P9 to P11: canaries are sound and blind to selection leaks; truncation finds divergence, not all dependence; property-tested</w:t>
             </w:r>
           </w:p>
         </w:tc>

</xml_diff>

<commit_message>
paper and reports: classify each contribution as conceptual, method, borrowed or empirical; project document left frozen
</commit_message>
<xml_diff>
--- a/docs/research/NOVELTY_REPORT/NOVELTY_ONE_PAGER.docx
+++ b/docs/research/NOVELTY_REPORT/NOVELTY_ONE_PAGER.docx
@@ -1470,7 +1470,314 @@
       </w:pPr>
       <w:r>
         <w:rPr/>
-        <w:t>What is new (and what is not)</w:t>
+        <w:t>What is new, and what kind of novelty it is (2026-10-17)</w:t>
+      </w:r>
+    </w:p>
+    <w:tbl>
+      <w:tblPr>
+        <w:tblW w:w="5000" w:type="pct"/>
+        <w:jc w:val="left"/>
+        <w:tblInd w:w="45" w:type="dxa"/>
+        <w:tblLayout w:type="fixed"/>
+        <w:tblCellMar>
+          <w:top w:w="45" w:type="dxa"/>
+          <w:left w:w="45" w:type="dxa"/>
+          <w:bottom w:w="45" w:type="dxa"/>
+          <w:right w:w="45" w:type="dxa"/>
+        </w:tblCellMar>
+      </w:tblPr>
+      <w:tblGrid>
+        <w:gridCol w:w="1104"/>
+        <w:gridCol w:w="10235"/>
+      </w:tblGrid>
+      <w:tr>
+        <w:trPr/>
+        <w:tc>
+          <w:tcPr>
+            <w:tcW w:w="1104" w:type="dxa"/>
+            <w:tcBorders>
+              <w:top w:val="single" w:sz="6" w:space="0" w:color="808080"/>
+              <w:left w:val="single" w:sz="6" w:space="0" w:color="808080"/>
+              <w:bottom w:val="single" w:sz="2" w:space="0" w:color="808080"/>
+              <w:right w:val="single" w:sz="6" w:space="0" w:color="808080"/>
+            </w:tcBorders>
+            <w:vAlign w:val="center"/>
+          </w:tcPr>
+          <w:p>
+            <w:pPr>
+              <w:pStyle w:val="TableHeading"/>
+              <w:suppressLineNumbers/>
+              <w:bidi w:val="0"/>
+              <w:spacing w:before="0" w:after="283"/>
+              <w:jc w:val="center"/>
+              <w:rPr/>
+            </w:pPr>
+            <w:r>
+              <w:rPr/>
+              <w:t>Kind</w:t>
+            </w:r>
+          </w:p>
+        </w:tc>
+        <w:tc>
+          <w:tcPr>
+            <w:tcW w:w="10235" w:type="dxa"/>
+            <w:tcBorders>
+              <w:top w:val="single" w:sz="6" w:space="0" w:color="808080"/>
+              <w:left w:val="single" w:sz="2" w:space="0" w:color="808080"/>
+              <w:bottom w:val="single" w:sz="2" w:space="0" w:color="808080"/>
+              <w:right w:val="single" w:sz="6" w:space="0" w:color="808080"/>
+            </w:tcBorders>
+            <w:vAlign w:val="center"/>
+          </w:tcPr>
+          <w:p>
+            <w:pPr>
+              <w:pStyle w:val="TableHeading"/>
+              <w:suppressLineNumbers/>
+              <w:bidi w:val="0"/>
+              <w:spacing w:before="0" w:after="283"/>
+              <w:jc w:val="center"/>
+              <w:rPr/>
+            </w:pPr>
+            <w:r>
+              <w:rPr/>
+              <w:t>Contributions</w:t>
+            </w:r>
+          </w:p>
+        </w:tc>
+      </w:tr>
+      <w:tr>
+        <w:trPr/>
+        <w:tc>
+          <w:tcPr>
+            <w:tcW w:w="1104" w:type="dxa"/>
+            <w:tcBorders>
+              <w:left w:val="single" w:sz="6" w:space="0" w:color="808080"/>
+              <w:bottom w:val="single" w:sz="2" w:space="0" w:color="808080"/>
+              <w:right w:val="single" w:sz="6" w:space="0" w:color="808080"/>
+            </w:tcBorders>
+            <w:vAlign w:val="center"/>
+          </w:tcPr>
+          <w:p>
+            <w:pPr>
+              <w:pStyle w:val="TableContents"/>
+              <w:bidi w:val="0"/>
+              <w:spacing w:before="0" w:after="283"/>
+              <w:rPr>
+                <w:b/>
+              </w:rPr>
+            </w:pPr>
+            <w:r>
+              <w:rPr>
+                <w:b/>
+              </w:rPr>
+              <w:t>Conceptual</w:t>
+            </w:r>
+          </w:p>
+        </w:tc>
+        <w:tc>
+          <w:tcPr>
+            <w:tcW w:w="10235" w:type="dxa"/>
+            <w:tcBorders>
+              <w:left w:val="single" w:sz="2" w:space="0" w:color="808080"/>
+              <w:bottom w:val="single" w:sz="2" w:space="0" w:color="808080"/>
+              <w:right w:val="single" w:sz="6" w:space="0" w:color="808080"/>
+            </w:tcBorders>
+            <w:vAlign w:val="center"/>
+          </w:tcPr>
+          <w:p>
+            <w:pPr>
+              <w:pStyle w:val="TableContents"/>
+              <w:bidi w:val="0"/>
+              <w:spacing w:before="0" w:after="283"/>
+              <w:rPr/>
+            </w:pPr>
+            <w:r>
+              <w:rPr/>
+              <w:t>(1) Reader-faithfulness as a two-channel contract (input, parameters) whose audits do not certify each other. (2) Hiding exposed facts can be worse than doing nothing, and exactly when (82 vs 23). (3) Leak kinds against oracles: content vs selection leaks, divergence vs dependence, and which test sees which; selection leaks are the newest idea</w:t>
+            </w:r>
+          </w:p>
+        </w:tc>
+      </w:tr>
+      <w:tr>
+        <w:trPr/>
+        <w:tc>
+          <w:tcPr>
+            <w:tcW w:w="1104" w:type="dxa"/>
+            <w:tcBorders>
+              <w:left w:val="single" w:sz="6" w:space="0" w:color="808080"/>
+              <w:bottom w:val="single" w:sz="2" w:space="0" w:color="808080"/>
+              <w:right w:val="single" w:sz="6" w:space="0" w:color="808080"/>
+            </w:tcBorders>
+            <w:vAlign w:val="center"/>
+          </w:tcPr>
+          <w:p>
+            <w:pPr>
+              <w:pStyle w:val="TableContents"/>
+              <w:bidi w:val="0"/>
+              <w:spacing w:before="0" w:after="283"/>
+              <w:rPr>
+                <w:b/>
+              </w:rPr>
+            </w:pPr>
+            <w:r>
+              <w:rPr>
+                <w:b/>
+              </w:rPr>
+              <w:t>Method</w:t>
+            </w:r>
+          </w:p>
+        </w:tc>
+        <w:tc>
+          <w:tcPr>
+            <w:tcW w:w="10235" w:type="dxa"/>
+            <w:tcBorders>
+              <w:left w:val="single" w:sz="2" w:space="0" w:color="808080"/>
+              <w:bottom w:val="single" w:sz="2" w:space="0" w:color="808080"/>
+              <w:right w:val="single" w:sz="6" w:space="0" w:color="808080"/>
+            </w:tcBorders>
+            <w:vAlign w:val="center"/>
+          </w:tcPr>
+          <w:p>
+            <w:pPr>
+              <w:pStyle w:val="TableContents"/>
+              <w:bidi w:val="0"/>
+              <w:spacing w:before="0" w:after="283"/>
+              <w:rPr/>
+            </w:pPr>
+            <w:r>
+              <w:rPr/>
+              <w:t>Truncate-and-rebuild with an exposure screen (standard causality check, new application); suffix canaries (canaries borrowed, new use after a reading position); counterfactual suffix; renaming probe (largely prior work)</w:t>
+            </w:r>
+          </w:p>
+        </w:tc>
+      </w:tr>
+      <w:tr>
+        <w:trPr/>
+        <w:tc>
+          <w:tcPr>
+            <w:tcW w:w="1104" w:type="dxa"/>
+            <w:tcBorders>
+              <w:left w:val="single" w:sz="6" w:space="0" w:color="808080"/>
+              <w:bottom w:val="single" w:sz="2" w:space="0" w:color="808080"/>
+              <w:right w:val="single" w:sz="6" w:space="0" w:color="808080"/>
+            </w:tcBorders>
+            <w:vAlign w:val="center"/>
+          </w:tcPr>
+          <w:p>
+            <w:pPr>
+              <w:pStyle w:val="TableContents"/>
+              <w:bidi w:val="0"/>
+              <w:spacing w:before="0" w:after="283"/>
+              <w:rPr>
+                <w:b/>
+              </w:rPr>
+            </w:pPr>
+            <w:r>
+              <w:rPr>
+                <w:b/>
+              </w:rPr>
+              <w:t>Borrowed</w:t>
+            </w:r>
+          </w:p>
+        </w:tc>
+        <w:tc>
+          <w:tcPr>
+            <w:tcW w:w="10235" w:type="dxa"/>
+            <w:tcBorders>
+              <w:left w:val="single" w:sz="2" w:space="0" w:color="808080"/>
+              <w:bottom w:val="single" w:sz="2" w:space="0" w:color="808080"/>
+              <w:right w:val="single" w:sz="6" w:space="0" w:color="808080"/>
+            </w:tcBorders>
+            <w:vAlign w:val="center"/>
+          </w:tcPr>
+          <w:p>
+            <w:pPr>
+              <w:pStyle w:val="TableContents"/>
+              <w:bidi w:val="0"/>
+              <w:spacing w:before="0" w:after="283"/>
+              <w:rPr/>
+            </w:pPr>
+            <w:r>
+              <w:rPr/>
+              <w:t>Versioned repair (feature-store point-in-time correctness, Dataflow watermarks)</w:t>
+            </w:r>
+          </w:p>
+        </w:tc>
+      </w:tr>
+      <w:tr>
+        <w:trPr/>
+        <w:tc>
+          <w:tcPr>
+            <w:tcW w:w="1104" w:type="dxa"/>
+            <w:tcBorders>
+              <w:left w:val="single" w:sz="6" w:space="0" w:color="808080"/>
+              <w:bottom w:val="single" w:sz="6" w:space="0" w:color="808080"/>
+              <w:right w:val="single" w:sz="6" w:space="0" w:color="808080"/>
+            </w:tcBorders>
+            <w:vAlign w:val="center"/>
+          </w:tcPr>
+          <w:p>
+            <w:pPr>
+              <w:pStyle w:val="TableContents"/>
+              <w:bidi w:val="0"/>
+              <w:spacing w:before="0" w:after="283"/>
+              <w:rPr>
+                <w:b/>
+              </w:rPr>
+            </w:pPr>
+            <w:r>
+              <w:rPr>
+                <w:b/>
+              </w:rPr>
+              <w:t>Empirical</w:t>
+            </w:r>
+          </w:p>
+        </w:tc>
+        <w:tc>
+          <w:tcPr>
+            <w:tcW w:w="10235" w:type="dxa"/>
+            <w:tcBorders>
+              <w:left w:val="single" w:sz="2" w:space="0" w:color="808080"/>
+              <w:bottom w:val="single" w:sz="6" w:space="0" w:color="808080"/>
+              <w:right w:val="single" w:sz="6" w:space="0" w:color="808080"/>
+            </w:tcBorders>
+            <w:vAlign w:val="center"/>
+          </w:tcPr>
+          <w:p>
+            <w:pPr>
+              <w:pStyle w:val="TableContents"/>
+              <w:bidi w:val="0"/>
+              <w:spacing w:before="0" w:after="283"/>
+              <w:rPr/>
+            </w:pPr>
+            <w:r>
+              <w:rPr/>
+              <w:t>All leak rates (6.0%, 18.5%, 22.8%, 40.6%, 19.4%, 47 vs 23, +26.0 points)</w:t>
+            </w:r>
+          </w:p>
+        </w:tc>
+      </w:tr>
+    </w:tbl>
+    <w:p>
+      <w:pPr>
+        <w:pStyle w:val="BodyText"/>
+        <w:bidi w:val="0"/>
+        <w:rPr/>
+      </w:pPr>
+      <w:r>
+        <w:rPr/>
+        <w:t>A framework-plus-instruments-plus-measurements paper, not a theory or algorithm paper. Prior-art search was bounded.</w:t>
+      </w:r>
+    </w:p>
+    <w:p>
+      <w:pPr>
+        <w:pStyle w:val="BodyText"/>
+        <w:bidi w:val="0"/>
+        <w:rPr/>
+      </w:pPr>
+      <w:r>
+        <w:rPr/>
+        <w:t>Earlier list (2026-10-16), kept for the record:</w:t>
       </w:r>
     </w:p>
     <w:p>

</xml_diff>